<commit_message>
Burq CSM: more confident cover letter opener and close
Co-Authored-By: Claude Opus 5.5 <noreply@anthropic.com>
Claude-Session: https://claude.ai/code/session_01XE6aV5LP3W9C1iWzBfgedS
</commit_message>
<xml_diff>
--- a/applications/burq-customer-success-manager/Burq-CustomerSuccessManager-CoverLetter.docx
+++ b/applications/burq-customer-success-manager/Burq-CustomerSuccessManager-CoverLetter.docx
@@ -94,7 +94,7 @@
           <w:b w:val="0"/>
           <w:color w:val="1A1A1A"/>
         </w:rPr>
-        <w:t>I'm applying for the Customer Success Manager role at Burq. Your posting describes someone who owns the account from onboarding through renewal, speaks credibly about integrations, and uses AI to solve problems instead of escalating and waiting. That's how I already work.</w:t>
+        <w:t>Your Customer Success Manager posting describes someone who owns the account from onboarding through renewal, speaks credibly about integrations, and uses AI to solve problems instead of escalating them. That's the work I've done for 15 years, and it's how I already operate.</w:t>
       </w:r>
     </w:p>
     <w:p>
@@ -120,7 +120,7 @@
           <w:b w:val="0"/>
           <w:color w:val="1A1A1A"/>
         </w:rPr>
-        <w:t>Logistics would be new territory for me on the platform side. The merchant side is familiar: I spent 15+ years in restaurant kitchens, where an order that leaves late is a customer you lose. I learn a domain fast by working inside it, and I'd bring that urgency to your merchants and enterprise partners. I'd welcome a conversation about the book you need covered.</w:t>
+        <w:t>Logistics would be new territory on the platform side. The merchant side is familiar: I spent 15+ years in restaurant kitchens, where an order that leaves late is a customer you lose. I learn a domain fast by working inside it, and I'll bring that urgency to your merchants and enterprise partners. Open to a call this week to talk through the book you need covered?</w:t>
       </w:r>
     </w:p>
     <w:p>

</xml_diff>

<commit_message>
Burq CSM: rewrite cover letter in a more human voice
Co-Authored-By: Claude Opus 5.5 <noreply@anthropic.com>
Claude-Session: https://claude.ai/code/session_01XE6aV5LP3W9C1iWzBfgedS
</commit_message>
<xml_diff>
--- a/applications/burq-customer-success-manager/Burq-CustomerSuccessManager-CoverLetter.docx
+++ b/applications/burq-customer-success-manager/Burq-CustomerSuccessManager-CoverLetter.docx
@@ -94,7 +94,7 @@
           <w:b w:val="0"/>
           <w:color w:val="1A1A1A"/>
         </w:rPr>
-        <w:t>Your Customer Success Manager posting describes someone who owns the account from onboarding through renewal, speaks credibly about integrations, and uses AI to solve problems instead of escalating them. That's the work I've done for 15 years, and it's how I already operate.</w:t>
+        <w:t>Burq is looking for a CSM who owns the account start to finish, can hold their own in a technical conversation, and reaches for AI before reaching for help. I've been doing that job for a long time, and I like it.</w:t>
       </w:r>
     </w:p>
     <w:p>
@@ -107,7 +107,7 @@
           <w:b w:val="0"/>
           <w:color w:val="1A1A1A"/>
         </w:rPr>
-        <w:t>At Birdeye, I owned a book of 15 to 20 reseller partners from onboarding through renewal and kept all but one (about 94%) by watching utilization and getting ahead of adoption gaps before they turned into churn. I fed structured customer feedback to Product and Engineering, and I was the person partners called when setup got technical. At Wix, I onboarded 25+ clients a month at 110% of implementation targets while leading a team of 20. Today at Solenzo, I connect systems through APIs in Zapier, Make, and n8n, write the Python and JavaScript code steps myself, and use Claude daily to draft account summaries, analyze performance data, and automate reporting.</w:t>
+        <w:t>The clearest example is Birdeye. I had 15 to 20 reseller partners, and I lost one. That wasn't luck. I watched how they used the product, caught problems early, and was the person they called when setup got messy. When I heard the same complaint twice, it went to Product. Before that, at Wix, I was onboarding 25+ clients a month and running a team of 20.</w:t>
       </w:r>
     </w:p>
     <w:p>
@@ -120,7 +120,20 @@
           <w:b w:val="0"/>
           <w:color w:val="1A1A1A"/>
         </w:rPr>
-        <w:t>Logistics would be new territory on the platform side. The merchant side is familiar: I spent 15+ years in restaurant kitchens, where an order that leaves late is a customer you lose. I learn a domain fast by working inside it, and I'll bring that urgency to your merchants and enterprise partners. Open to a call this week to talk through the book you need covered?</w:t>
+        <w:t>These days I run my own shop. I wire systems together through APIs, write the code myself when a no-code tool can't do the job, and use Claude every day to write account summaries, dig through data, and automate the reporting I used to do by hand.</w:t>
+      </w:r>
+    </w:p>
+    <w:p>
+      <w:pPr>
+        <w:spacing w:after="160"/>
+      </w:pPr>
+      <w:r>
+        <w:rPr>
+          <w:rFonts w:ascii="Calibri" w:hAnsi="Calibri"/>
+          <w:b w:val="0"/>
+          <w:color w:val="1A1A1A"/>
+        </w:rPr>
+        <w:t>I haven't worked in logistics. I have worked the line in restaurant kitchens for 15+ years, so I know exactly what a late order costs a merchant. I'd like to put that to work for yours. Got time for a call this week?</w:t>
       </w:r>
     </w:p>
     <w:p>

</xml_diff>